<commit_message>
preview: claude/field-service-module-poc-hslouq (952b9570f167ae46a35e5aeb6874c6d6fd69a019) 952b9570f167ae46a35e5aeb6874c6d6fd69a019
</commit_message>
<xml_diff>
--- a/preview/field-service-module-poc-hslouq/docs/RITHI_Software_Validation_R-QMS-SV-13_Rev02.docx
+++ b/preview/field-service-module-poc-hslouq/docs/RITHI_Software_Validation_R-QMS-SV-13_Rev02.docx
@@ -4618,20 +4618,6 @@
                 <w:szCs w:val="17"/>
                 <w:lang w:val="en-IN"/>
               </w:rPr>
-              <w:t xml:space="preserve">R-44: The auto review answers a call it must not</w:t>
-            </w:r>
-          </w:p>
-          <w:p>
-            <w:pPr>
-              <w:spacing w:before="20" w:after="20"/>
-              <w:jc w:val="left"/>
-            </w:pPr>
-            <w:r>
-              <w:rPr>
-                <w:sz w:val="17"/>
-                <w:szCs w:val="17"/>
-                <w:lang w:val="en-IN"/>
-              </w:rPr>
               <w:t xml:space="preserve">R-45: A YES raises no report, two reports, or a report carrying a CAPA decision nobody made</w:t>
             </w:r>
           </w:p>
@@ -4702,7 +4688,21 @@
                 <w:szCs w:val="17"/>
                 <w:lang w:val="en-IN"/>
               </w:rPr>
-              <w:t xml:space="preserve">… and 19 more (section 4)</w:t>
+              <w:t xml:space="preserve">R-50: A completion date is changed by somebody other than an administrator, or without a record</w:t>
+            </w:r>
+          </w:p>
+          <w:p>
+            <w:pPr>
+              <w:spacing w:before="20" w:after="20"/>
+              <w:jc w:val="left"/>
+            </w:pPr>
+            <w:r>
+              <w:rPr>
+                <w:sz w:val="17"/>
+                <w:szCs w:val="17"/>
+                <w:lang w:val="en-IN"/>
+              </w:rPr>
+              <w:t xml:space="preserve">… and 18 more (section 4)</w:t>
             </w:r>
           </w:p>
         </w:tc>
@@ -12399,7 +12399,7 @@
                 <w:szCs w:val="17"/>
                 <w:lang w:val="en-IN"/>
               </w:rPr>
-              <w:t xml:space="preserve">R-44 Automatic answer to Review 2: The auto review answers a call it must not — a first-year failure, an unknown age, a Review 2 a person had begun — or answers while nobody authorised has switched it on, or names the wrong person</w:t>
+              <w:t xml:space="preserve">R-45 Field Failure Report raised by a review: A YES raises no report, two reports, or a report carrying a CAPA decision nobody made</w:t>
             </w:r>
           </w:p>
         </w:tc>
@@ -12418,7 +12418,7 @@
                 <w:szCs w:val="17"/>
                 <w:lang w:val="en-IN"/>
               </w:rPr>
-              <w:t xml:space="preserve">The switch is held by review.auto alone and refused by the database to anyone else; the exclusions are in the database function, not the screen; each answer names the person who switched it on and carries an auto-review marker Review 3 reads; the run reports what it left for a person. OPEN until D-028 is fixed</w:t>
+              <w:t xml:space="preserve">A database trigger on the review raises it, from the base tables, at most once per UCN; it is never withdrawn; CAPA fields are left blank; imported reviews raise nothing. OPEN until D-029 is fixed for the CAPA defaults</w:t>
             </w:r>
           </w:p>
         </w:tc>
@@ -12456,7 +12456,7 @@
                 <w:szCs w:val="17"/>
                 <w:lang w:val="en-IN"/>
               </w:rPr>
-              <w:t xml:space="preserve">Residual Low · OQ-84, OQ-85</w:t>
+              <w:t xml:space="preserve">Residual Low · OQ-86, OQ-87</w:t>
             </w:r>
           </w:p>
         </w:tc>
@@ -12518,7 +12518,7 @@
                 <w:szCs w:val="17"/>
                 <w:lang w:val="en-IN"/>
               </w:rPr>
-              <w:t xml:space="preserve">R-45 Field Failure Report raised by a review: A YES raises no report, two reports, or a report carrying a CAPA decision nobody made</w:t>
+              <w:t xml:space="preserve">R-46 Loading historical reviews: A load attributes old judgements to the person loading them, raises reports for them, or cannot be told apart from reviews made here</w:t>
             </w:r>
           </w:p>
         </w:tc>
@@ -12537,7 +12537,7 @@
                 <w:szCs w:val="17"/>
                 <w:lang w:val="en-IN"/>
               </w:rPr>
-              <w:t xml:space="preserve">A database trigger on the review raises it, from the base tables, at most once per UCN; it is never withdrawn; CAPA fields are left blank; imported reviews raise nothing. OPEN until D-029 is fixed for the CAPA defaults</w:t>
+              <w:t xml:space="preserve">The file’s names and dates are kept; no identity of the loader is stamped; every row is marked imported; no report is raised; matched on UCN so a re-load corrects. OPEN until D-029 is fixed</w:t>
             </w:r>
           </w:p>
         </w:tc>
@@ -12575,7 +12575,7 @@
                 <w:szCs w:val="17"/>
                 <w:lang w:val="en-IN"/>
               </w:rPr>
-              <w:t xml:space="preserve">Residual Low · OQ-86, OQ-87</w:t>
+              <w:t xml:space="preserve">Residual Low · OQ-88 — passed 27-Oct-2026</w:t>
             </w:r>
           </w:p>
         </w:tc>
@@ -12637,7 +12637,7 @@
                 <w:szCs w:val="17"/>
                 <w:lang w:val="en-IN"/>
               </w:rPr>
-              <w:t xml:space="preserve">R-46 Loading historical reviews: A load attributes old judgements to the person loading them, raises reports for them, or cannot be told apart from reviews made here</w:t>
+              <w:t xml:space="preserve">R-47 Bulk and automatically saved review answers: A bulk action includes a first-year or already-answered call, or an automatic save commits a value nobody chose</w:t>
             </w:r>
           </w:p>
         </w:tc>
@@ -12656,7 +12656,7 @@
                 <w:szCs w:val="17"/>
                 <w:lang w:val="en-IN"/>
               </w:rPr>
-              <w:t xml:space="preserve">The file’s names and dates are kept; no identity of the loader is stamped; every row is marked imported; no report is raised; matched on UCN so a re-load corrects. OPEN until D-029 is fixed</w:t>
+              <w:t xml:space="preserve">The database refuses first-year, unknown-age and answered calls in the bulk function; a confirmation states the count; pick lists never commit on a keystroke; every save is attributed to its session</w:t>
             </w:r>
           </w:p>
         </w:tc>
@@ -12694,7 +12694,7 @@
                 <w:szCs w:val="17"/>
                 <w:lang w:val="en-IN"/>
               </w:rPr>
-              <w:t xml:space="preserve">Residual Low · OQ-88 — passed 27-Oct-2026</w:t>
+              <w:t xml:space="preserve">Residual Low · OQ-89, OQ-90</w:t>
             </w:r>
           </w:p>
         </w:tc>
@@ -12756,7 +12756,7 @@
                 <w:szCs w:val="17"/>
                 <w:lang w:val="en-IN"/>
               </w:rPr>
-              <w:t xml:space="preserve">R-47 Bulk and automatically saved review answers: A bulk action includes a first-year or already-answered call, or an automatic save commits a value nobody chose</w:t>
+              <w:t xml:space="preserve">R-48 Evidence presented to the reviewer: The repeat-failure verdict, the age at failure or the visit context is wrong or silently absent</w:t>
             </w:r>
           </w:p>
         </w:tc>
@@ -12775,7 +12775,7 @@
                 <w:szCs w:val="17"/>
                 <w:lang w:val="en-IN"/>
               </w:rPr>
-              <w:t xml:space="preserve">The database refuses first-year, unknown-age and answered calls in the bulk function; a confirmation states the count; pick lists never commit on a keystroke; every save is attributed to its session</w:t>
+              <w:t xml:space="preserve">The verdict is computed in the database under both rules and states which fired; an unknown age reads not known, never a number; a failed context read says so</w:t>
             </w:r>
           </w:p>
         </w:tc>
@@ -12813,7 +12813,7 @@
                 <w:szCs w:val="17"/>
                 <w:lang w:val="en-IN"/>
               </w:rPr>
-              <w:t xml:space="preserve">Residual Low · OQ-89, OQ-90</w:t>
+              <w:t xml:space="preserve">Residual Low · OQ-91, OQ-92</w:t>
             </w:r>
           </w:p>
         </w:tc>
@@ -12875,7 +12875,7 @@
                 <w:szCs w:val="17"/>
                 <w:lang w:val="en-IN"/>
               </w:rPr>
-              <w:t xml:space="preserve">R-48 Evidence presented to the reviewer: The repeat-failure verdict, the age at failure or the visit context is wrong or silently absent</w:t>
+              <w:t xml:space="preserve">R-49 Attribution of a failure to a product line: A failure is counted against the wrong product, or the correction alters the call</w:t>
             </w:r>
           </w:p>
         </w:tc>
@@ -12894,7 +12894,7 @@
                 <w:szCs w:val="17"/>
                 <w:lang w:val="en-IN"/>
               </w:rPr>
-              <w:t xml:space="preserve">The verdict is computed in the database under both rules and states which fired; an unknown age reads not known, never a number; a failed context read says so</w:t>
+              <w:t xml:space="preserve">The actual product is held on the review, not the call; every analysis reads the review’s product where one is recorded; only review.edit holders may set it</w:t>
             </w:r>
           </w:p>
         </w:tc>
@@ -12932,7 +12932,7 @@
                 <w:szCs w:val="17"/>
                 <w:lang w:val="en-IN"/>
               </w:rPr>
-              <w:t xml:space="preserve">Residual Low · OQ-91, OQ-92</w:t>
+              <w:t xml:space="preserve">Residual Low · OQ-93 — passed 27-Oct-2026</w:t>
             </w:r>
           </w:p>
         </w:tc>
@@ -12994,7 +12994,7 @@
                 <w:szCs w:val="17"/>
                 <w:lang w:val="en-IN"/>
               </w:rPr>
-              <w:t xml:space="preserve">R-49 Attribution of a failure to a product line: A failure is counted against the wrong product, or the correction alters the call</w:t>
+              <w:t xml:space="preserve">R-50 Review completion dates: A completion date is changed by somebody other than an administrator, or without a record</w:t>
             </w:r>
           </w:p>
         </w:tc>
@@ -13013,7 +13013,7 @@
                 <w:szCs w:val="17"/>
                 <w:lang w:val="en-IN"/>
               </w:rPr>
-              <w:t xml:space="preserve">The actual product is held on the review, not the call; every analysis reads the review’s product where one is recorded; only review.edit holders may set it</w:t>
+              <w:t xml:space="preserve">The database refuses a non-administrator change and records every change with before and after, person and time. OPEN until D-020 is fixed</w:t>
             </w:r>
           </w:p>
         </w:tc>
@@ -13051,7 +13051,7 @@
                 <w:szCs w:val="17"/>
                 <w:lang w:val="en-IN"/>
               </w:rPr>
-              <w:t xml:space="preserve">Residual Low · OQ-93 — passed 27-Oct-2026</w:t>
+              <w:t xml:space="preserve">Residual Low · OQ-94</w:t>
             </w:r>
           </w:p>
         </w:tc>
@@ -13113,7 +13113,7 @@
                 <w:szCs w:val="17"/>
                 <w:lang w:val="en-IN"/>
               </w:rPr>
-              <w:t xml:space="preserve">R-50 Review completion dates: A completion date is changed by somebody other than an administrator, or without a record</w:t>
+              <w:t xml:space="preserve">R-51 Field Failure Report creation and completion: A report is raised without its problem or customer, renumbered, re-attributed, deleted, or left unreviewed with no means of recording the review</w:t>
             </w:r>
           </w:p>
         </w:tc>
@@ -13132,7 +13132,7 @@
                 <w:szCs w:val="17"/>
                 <w:lang w:val="en-IN"/>
               </w:rPr>
-              <w:t xml:space="preserve">The database refuses a non-administrator change and records every change with before and after, person and time. OPEN until D-020 is fixed</w:t>
+              <w:t xml:space="preserve">The number is issued and fixed by the database; the raiser is stamped and kept; mandatory fields refused by the database as well as the form; deletion blocked (0166); the weekly review recordable from the form. OPEN until D-027 is fixed</w:t>
             </w:r>
           </w:p>
         </w:tc>
@@ -13170,7 +13170,7 @@
                 <w:szCs w:val="17"/>
                 <w:lang w:val="en-IN"/>
               </w:rPr>
-              <w:t xml:space="preserve">Residual Low · OQ-94</w:t>
+              <w:t xml:space="preserve">Residual Low · OQ-97, OQ-98</w:t>
             </w:r>
           </w:p>
         </w:tc>
@@ -13232,7 +13232,7 @@
                 <w:szCs w:val="17"/>
                 <w:lang w:val="en-IN"/>
               </w:rPr>
-              <w:t xml:space="preserve">R-51 Field Failure Report creation and completion: A report is raised without its problem or customer, renumbered, re-attributed, deleted, or left unreviewed with no means of recording the review</w:t>
+              <w:t xml:space="preserve">R-52 Widened visibility for failure-report readers: The function that gives register readers the visits and spares behind a report returns other calls, or the printable report opens for somebody refused the register</w:t>
             </w:r>
           </w:p>
         </w:tc>
@@ -13251,7 +13251,7 @@
                 <w:szCs w:val="17"/>
                 <w:lang w:val="en-IN"/>
               </w:rPr>
-              <w:t xml:space="preserve">The number is issued and fixed by the database; the raiser is stamped and kept; mandatory fields refused by the database as well as the form; deletion blocked (0166); the weekly review recordable from the form. OPEN until D-027 is fixed</w:t>
+              <w:t xml:space="preserve">The definer function tests ffr.view and returns only for a UCN that has a report; the print route checks the register’s module key before row-level security. OPEN until D-026 is fixed</w:t>
             </w:r>
           </w:p>
         </w:tc>
@@ -13289,7 +13289,7 @@
                 <w:szCs w:val="17"/>
                 <w:lang w:val="en-IN"/>
               </w:rPr>
-              <w:t xml:space="preserve">Residual Low · OQ-97, OQ-98</w:t>
+              <w:t xml:space="preserve">Residual Low · OQ-99 — passed 27-Oct-2026</w:t>
             </w:r>
           </w:p>
         </w:tc>
@@ -13351,7 +13351,7 @@
                 <w:szCs w:val="17"/>
                 <w:lang w:val="en-IN"/>
               </w:rPr>
-              <w:t xml:space="preserve">R-52 Widened visibility for failure-report readers: The function that gives register readers the visits and spares behind a report returns other calls, or the printable report opens for somebody refused the register</w:t>
+              <w:t xml:space="preserve">R-57 Correcting a pending request: A correction writes values the request form would have refused, or changes who raised it</w:t>
             </w:r>
           </w:p>
         </w:tc>
@@ -13370,7 +13370,7 @@
                 <w:szCs w:val="17"/>
                 <w:lang w:val="en-IN"/>
               </w:rPr>
-              <w:t xml:space="preserve">The definer function tests ffr.view and returns only for a UCN that has a report; the print route checks the register’s module key before row-level security. OPEN until D-026 is fixed</w:t>
+              <w:t xml:space="preserve">The correction is refused after Pending by screen and database (FRS-087); a zero-row save is reported as not saved. OPEN: every corrected field is free text and the address is correctable (D-030); OQ-112</w:t>
             </w:r>
           </w:p>
         </w:tc>
@@ -13408,7 +13408,7 @@
                 <w:szCs w:val="17"/>
                 <w:lang w:val="en-IN"/>
               </w:rPr>
-              <w:t xml:space="preserve">Residual Low · OQ-99 — passed 27-Oct-2026</w:t>
+              <w:t xml:space="preserve">Residual Medium · OQ-112</w:t>
             </w:r>
           </w:p>
         </w:tc>
@@ -13470,7 +13470,7 @@
                 <w:szCs w:val="17"/>
                 <w:lang w:val="en-IN"/>
               </w:rPr>
-              <w:t xml:space="preserve">R-57 Correcting a pending request: A correction writes values the request form would have refused, or changes who raised it</w:t>
+              <w:t xml:space="preserve">R-58 Disposition of a pending request: A request is mapped to a call that does not exist, reported closed when nothing was written, or left pending beside the call registered from it</w:t>
             </w:r>
           </w:p>
         </w:tc>
@@ -13489,7 +13489,7 @@
                 <w:szCs w:val="17"/>
                 <w:lang w:val="en-IN"/>
               </w:rPr>
-              <w:t xml:space="preserve">The correction is refused after Pending by screen and database (FRS-087); a zero-row save is reported as not saved. OPEN: every corrected field is free text and the address is correctable (D-030); OQ-112</w:t>
+              <w:t xml:space="preserve">Three stated outcomes; the row audit on call_requests records every change. OPEN: map-anyway confirm, no row count, back-fill swallowed (D-031); OQ-113</w:t>
             </w:r>
           </w:p>
         </w:tc>
@@ -13527,7 +13527,7 @@
                 <w:szCs w:val="17"/>
                 <w:lang w:val="en-IN"/>
               </w:rPr>
-              <w:t xml:space="preserve">Residual Medium · OQ-112</w:t>
+              <w:t xml:space="preserve">Residual Medium · OQ-113</w:t>
             </w:r>
           </w:p>
         </w:tc>
@@ -13589,7 +13589,7 @@
                 <w:szCs w:val="17"/>
                 <w:lang w:val="en-IN"/>
               </w:rPr>
-              <w:t xml:space="preserve">R-58 Disposition of a pending request: A request is mapped to a call that does not exist, reported closed when nothing was written, or left pending beside the call registered from it</w:t>
+              <w:t xml:space="preserve">R-59 Registering a call: A refused or failed registration is kept in the browser under a UCN of its own making</w:t>
             </w:r>
           </w:p>
         </w:tc>
@@ -13608,7 +13608,7 @@
                 <w:szCs w:val="17"/>
                 <w:lang w:val="en-IN"/>
               </w:rPr>
-              <w:t xml:space="preserve">Three stated outcomes; the row audit on call_requests records every change. OPEN: map-anyway confirm, no row count, back-fill swallowed (D-031); OQ-113</w:t>
+              <w:t xml:space="preserve">The database assigns the UCN (FRS-005) and refuses by RLS. OPEN: the local fallback (D-032); OQ-116</w:t>
             </w:r>
           </w:p>
         </w:tc>
@@ -13646,7 +13646,7 @@
                 <w:szCs w:val="17"/>
                 <w:lang w:val="en-IN"/>
               </w:rPr>
-              <w:t xml:space="preserve">Residual Medium · OQ-113</w:t>
+              <w:t xml:space="preserve">Residual Medium · OQ-116</w:t>
             </w:r>
           </w:p>
         </w:tc>
@@ -13708,7 +13708,7 @@
                 <w:szCs w:val="17"/>
                 <w:lang w:val="en-IN"/>
               </w:rPr>
-              <w:t xml:space="preserve">R-59 Registering a call: A refused or failed registration is kept in the browser under a UCN of its own making</w:t>
+              <w:t xml:space="preserve">R-60 Vigilance answers at registration: The three vigilance questions are recorded as NO without being answered</w:t>
             </w:r>
           </w:p>
         </w:tc>
@@ -13727,7 +13727,7 @@
                 <w:szCs w:val="17"/>
                 <w:lang w:val="en-IN"/>
               </w:rPr>
-              <w:t xml:space="preserve">The database assigns the UCN (FRS-005) and refuses by RLS. OPEN: the local fallback (D-032); OQ-116</w:t>
+              <w:t xml:space="preserve">The section is emphasised; amendment needs its own right and is audited. OPEN: each field defaults to NO (D-033); OQ-117</w:t>
             </w:r>
           </w:p>
         </w:tc>
@@ -13765,7 +13765,7 @@
                 <w:szCs w:val="17"/>
                 <w:lang w:val="en-IN"/>
               </w:rPr>
-              <w:t xml:space="preserve">Residual Medium · OQ-116</w:t>
+              <w:t xml:space="preserve">Residual Medium · OQ-117</w:t>
             </w:r>
           </w:p>
         </w:tc>
@@ -13827,7 +13827,7 @@
                 <w:szCs w:val="17"/>
                 <w:lang w:val="en-IN"/>
               </w:rPr>
-              <w:t xml:space="preserve">R-60 Vigilance answers at registration: The three vigilance questions are recorded as NO without being answered</w:t>
+              <w:t xml:space="preserve">R-61 Amending, cancelling and re-opening a call: A sectional right cannot be used, a closed call is cancelled round the screen, or a re-open leaves no reason</w:t>
             </w:r>
           </w:p>
         </w:tc>
@@ -13846,7 +13846,7 @@
                 <w:szCs w:val="17"/>
                 <w:lang w:val="en-IN"/>
               </w:rPr>
-              <w:t xml:space="preserve">The section is emphasised; amendment needs its own right and is audited. OPEN: each field defaults to NO (D-033); OQ-117</w:t>
+              <w:t xml:space="preserve">Section rights enforced by triggers (0127); cancel needs calls.cancel and a reason; re-open needs pending.register or calls.create; record_audit captures the row. OPEN: D-035, D-036 (D-034 fixed 2026-09-30); OQ-120, OQ-123</w:t>
             </w:r>
           </w:p>
         </w:tc>
@@ -13884,7 +13884,7 @@
                 <w:szCs w:val="17"/>
                 <w:lang w:val="en-IN"/>
               </w:rPr>
-              <w:t xml:space="preserve">Residual Medium · OQ-117</w:t>
+              <w:t xml:space="preserve">Residual Medium · OQ-120, OQ-121, OQ-122, OQ-123</w:t>
             </w:r>
           </w:p>
         </w:tc>
@@ -13946,7 +13946,7 @@
                 <w:szCs w:val="17"/>
                 <w:lang w:val="en-IN"/>
               </w:rPr>
-              <w:t xml:space="preserve">R-61 Amending, cancelling and re-opening a call: A sectional right cannot be used, a closed call is cancelled round the screen, or a re-open leaves no reason</w:t>
+              <w:t xml:space="preserve">R-93 Loading historical Daily Complaint Reviews: The uploader is recorded as the reviewer, or a Field Failure Report is raised from a loaded review</w:t>
             </w:r>
           </w:p>
         </w:tc>
@@ -13965,7 +13965,7 @@
                 <w:szCs w:val="17"/>
                 <w:lang w:val="en-IN"/>
               </w:rPr>
-              <w:t xml:space="preserve">Section rights enforced by triggers (0127); cancel needs calls.cancel and a reason; re-open needs pending.register or calls.create; record_audit captures the row. OPEN: D-035, D-036 (D-034 fixed 2026-09-30); OQ-120, OQ-123</w:t>
+              <w:t xml:space="preserve">The file’s reviewer names and dates kept; no session identity stamped on a loaded review; an import mark on every loaded review; the FFR trigger passes a marked review; keyed on UCN so a corrected file updates. Residual High until D-029 is closed — today a DCCR load would do both. OQ-88</w:t>
             </w:r>
           </w:p>
         </w:tc>
@@ -14003,7 +14003,7 @@
                 <w:szCs w:val="17"/>
                 <w:lang w:val="en-IN"/>
               </w:rPr>
-              <w:t xml:space="preserve">Residual Medium · OQ-120, OQ-121, OQ-122, OQ-123</w:t>
+              <w:t xml:space="preserve">Residual High · OQ-88 — passed 27-Oct-2026</w:t>
             </w:r>
           </w:p>
         </w:tc>
@@ -14065,7 +14065,7 @@
                 <w:szCs w:val="17"/>
                 <w:lang w:val="en-IN"/>
               </w:rPr>
-              <w:t xml:space="preserve">R-93 Loading historical Daily Complaint Reviews: The uploader is recorded as the reviewer, or a Field Failure Report is raised from a loaded review</w:t>
+              <w:t xml:space="preserve">R-99 Fleet frequent-failure rule: A fault repeating across machines of one model is not flagged, or repeated calls on one machine are read as a fleet fault</w:t>
             </w:r>
           </w:p>
         </w:tc>
@@ -14084,7 +14084,7 @@
                 <w:szCs w:val="17"/>
                 <w:lang w:val="en-IN"/>
               </w:rPr>
-              <w:t xml:space="preserve">The file’s reviewer names and dates kept; no session identity stamped on a loaded review; an import mark on every loaded review; the FFR trigger passes a marked review; keyed on UCN so a corrected file updates. Residual High until D-029 is closed — today a DCCR load would do both. OQ-88</w:t>
+              <w:t xml:space="preserve">Counted on DISTINCT serials of one product within a window in days, the call under review counted; either rule marks a frequent failure and names which fired; recorded answers not re-based. OQ-198</w:t>
             </w:r>
           </w:p>
         </w:tc>
@@ -14122,7 +14122,7 @@
                 <w:szCs w:val="17"/>
                 <w:lang w:val="en-IN"/>
               </w:rPr>
-              <w:t xml:space="preserve">Residual High · OQ-88 — passed 27-Oct-2026</w:t>
+              <w:t xml:space="preserve">Residual Low · OQ-198 — passed 27-Oct-2026</w:t>
             </w:r>
           </w:p>
         </w:tc>
@@ -14184,7 +14184,7 @@
                 <w:szCs w:val="17"/>
                 <w:lang w:val="en-IN"/>
               </w:rPr>
-              <w:t xml:space="preserve">R-99 Fleet frequent-failure rule: A fault repeating across machines of one model is not flagged, or repeated calls on one machine are read as a fleet fault</w:t>
+              <w:t xml:space="preserve">R-42 Configuration of a read-only role: A role described as read-only holds an authority that writes</w:t>
             </w:r>
           </w:p>
         </w:tc>
@@ -14203,7 +14203,7 @@
                 <w:szCs w:val="17"/>
                 <w:lang w:val="en-IN"/>
               </w:rPr>
-              <w:t xml:space="preserve">Counted on DISTINCT serials of one product within a window in days, the call under review counted; either rule marks a frequent failure and names which fired; recorded answers not re-based. OQ-198</w:t>
+              <w:t xml:space="preserve">The copy is a one-time seed rather than a standing mirror, so a later grant cannot cross; the write authority held by each such role is reported by diagnostic and presented as a matter for review, since a grant may be deliberate</w:t>
             </w:r>
           </w:p>
         </w:tc>
@@ -14241,7 +14241,7 @@
                 <w:szCs w:val="17"/>
                 <w:lang w:val="en-IN"/>
               </w:rPr>
-              <w:t xml:space="preserve">Residual Low · OQ-198 — passed 27-Oct-2026</w:t>
+              <w:t xml:space="preserve">Residual Medium</w:t>
             </w:r>
           </w:p>
         </w:tc>
@@ -14303,7 +14303,7 @@
                 <w:szCs w:val="17"/>
                 <w:lang w:val="en-IN"/>
               </w:rPr>
-              <w:t xml:space="preserve">R-42 Configuration of a read-only role: A role described as read-only holds an authority that writes</w:t>
+              <w:t xml:space="preserve">R-37 Attribution of a judgement on a failure: A completed review records no person, or records the wrong one</w:t>
             </w:r>
           </w:p>
         </w:tc>
@@ -14322,7 +14322,7 @@
                 <w:szCs w:val="17"/>
                 <w:lang w:val="en-IN"/>
               </w:rPr>
-              <w:t xml:space="preserve">The copy is a one-time seed rather than a standing mirror, so a later grant cannot cross; the write authority held by each such role is reported by diagnostic and presented as a matter for review, since a grant may be deliberate</w:t>
+              <w:t xml:space="preserve">The identity is taken from the authenticated session at completion by a database trigger, on every write path including automatic and bulk saves; it is not re-stamped by later edits; the name is carried onto the report; no screen name is ever written</w:t>
             </w:r>
           </w:p>
         </w:tc>
@@ -14360,7 +14360,7 @@
                 <w:szCs w:val="17"/>
                 <w:lang w:val="en-IN"/>
               </w:rPr>
-              <w:t xml:space="preserve">Residual Medium</w:t>
+              <w:t xml:space="preserve">Residual Low</w:t>
             </w:r>
           </w:p>
         </w:tc>
@@ -14422,7 +14422,7 @@
                 <w:szCs w:val="17"/>
                 <w:lang w:val="en-IN"/>
               </w:rPr>
-              <w:t xml:space="preserve">R-37 Attribution of a judgement on a failure: A completed review records no person, or records the wrong one</w:t>
+              <w:t xml:space="preserve">R-38 Amendment of a field failure report: A report is changed and the change is not recorded, or the record of it is altered</w:t>
             </w:r>
           </w:p>
         </w:tc>
@@ -14441,7 +14441,7 @@
                 <w:szCs w:val="17"/>
                 <w:lang w:val="en-IN"/>
               </w:rPr>
-              <w:t xml:space="preserve">The identity is taken from the authenticated session at completion by a database trigger, on every write path including automatic and bulk saves; it is not re-stamped by later edits; the name is carried onto the report; no screen name is ever written</w:t>
+              <w:t xml:space="preserve">A database trigger records every UPDATE with its before/after values and its author, independently of the application; the log has no insert, update or delete policy and the deletion guard is armed on it; reading needs ffr.manage or administrator</w:t>
             </w:r>
           </w:p>
         </w:tc>
@@ -14541,7 +14541,7 @@
                 <w:szCs w:val="17"/>
                 <w:lang w:val="en-IN"/>
               </w:rPr>
-              <w:t xml:space="preserve">R-38 Amendment of a field failure report: A report is changed and the change is not recorded, or the record of it is altered</w:t>
+              <w:t xml:space="preserve">R-03 Call status: Status does not reflect the latest visit</w:t>
             </w:r>
           </w:p>
         </w:tc>
@@ -14560,7 +14560,7 @@
                 <w:szCs w:val="17"/>
                 <w:lang w:val="en-IN"/>
               </w:rPr>
-              <w:t xml:space="preserve">A database trigger records every UPDATE with its before/after values and its author, independently of the application; the log has no insert, update or delete policy and the deletion guard is armed on it; reading needs ffr.manage or administrator</w:t>
+              <w:t xml:space="preserve">Trigger recomputes from latest entry; open_state generated column; OQ FRS-007</w:t>
             </w:r>
           </w:p>
         </w:tc>
@@ -14660,7 +14660,7 @@
                 <w:szCs w:val="17"/>
                 <w:lang w:val="en-IN"/>
               </w:rPr>
-              <w:t xml:space="preserve">R-03 Call status: Status does not reflect the latest visit</w:t>
+              <w:t xml:space="preserve">R-05 Identifier assignment: Duplicate or missing UCN / Call Number</w:t>
             </w:r>
           </w:p>
         </w:tc>
@@ -14679,7 +14679,7 @@
                 <w:szCs w:val="17"/>
                 <w:lang w:val="en-IN"/>
               </w:rPr>
-              <w:t xml:space="preserve">Trigger recomputes from latest entry; open_state generated column; OQ FRS-007</w:t>
+              <w:t xml:space="preserve">DB triggers + unique constraint + shared sequence; OQ FRS-005</w:t>
             </w:r>
           </w:p>
         </w:tc>
@@ -14779,7 +14779,7 @@
                 <w:szCs w:val="17"/>
                 <w:lang w:val="en-IN"/>
               </w:rPr>
-              <w:t xml:space="preserve">R-05 Identifier assignment: Duplicate or missing UCN / Call Number</w:t>
+              <w:t xml:space="preserve">R-09 Bulk import: PM batch imports wrong/duplicate rows</w:t>
             </w:r>
           </w:p>
         </w:tc>
@@ -14798,7 +14798,7 @@
                 <w:szCs w:val="17"/>
                 <w:lang w:val="en-IN"/>
               </w:rPr>
-              <w:t xml:space="preserve">DB triggers + unique constraint + shared sequence; OQ FRS-005</w:t>
+              <w:t xml:space="preserve">Preview before commit; DB assigns identifiers; admin-only; OQ FRS-009</w:t>
             </w:r>
           </w:p>
         </w:tc>
@@ -14898,7 +14898,7 @@
                 <w:szCs w:val="17"/>
                 <w:lang w:val="en-IN"/>
               </w:rPr>
-              <w:t xml:space="preserve">R-09 Bulk import: PM batch imports wrong/duplicate rows</w:t>
+              <w:t xml:space="preserve">R-18 Bulk re-allotment: A bulk edit writes rows the user did not intend, or allots outside the manager’s team</w:t>
             </w:r>
           </w:p>
         </w:tc>
@@ -14917,7 +14917,7 @@
                 <w:szCs w:val="17"/>
                 <w:lang w:val="en-IN"/>
               </w:rPr>
-              <w:t xml:space="preserve">Preview before commit; DB assigns identifiers; admin-only; OQ FRS-009</w:t>
+              <w:t xml:space="preserve">Selection is limited to the rows currently listed, never rows a filter hides; the edit touches one field; the engineer list is the reporting sub-tree and the write is constrained again by RLS; OQ-22</w:t>
             </w:r>
           </w:p>
         </w:tc>
@@ -15017,7 +15017,7 @@
                 <w:szCs w:val="17"/>
                 <w:lang w:val="en-IN"/>
               </w:rPr>
-              <w:t xml:space="preserve">R-18 Bulk re-allotment: A bulk edit writes rows the user did not intend, or allots outside the manager’s team</w:t>
+              <w:t xml:space="preserve">R-20 Acting for a team member: A record is raised for an engineer outside the manager’s team, or its authorship is lost</w:t>
             </w:r>
           </w:p>
         </w:tc>
@@ -15036,7 +15036,7 @@
                 <w:szCs w:val="17"/>
                 <w:lang w:val="en-IN"/>
               </w:rPr>
-              <w:t xml:space="preserve">Selection is limited to the rows currently listed, never rows a filter hides; the edit touches one field; the engineer list is the reporting sub-tree and the write is constrained again by RLS; OQ-22</w:t>
+              <w:t xml:space="preserve">The list offered is the reporting sub-tree; created_by retains the author independently of the engineer named; OQ-24</w:t>
             </w:r>
           </w:p>
         </w:tc>
@@ -15099,125 +15099,6 @@
                 <w:lang w:val="en-IN"/>
               </w:rPr>
               <w:t xml:space="preserve">5.24</w:t>
-            </w:r>
-          </w:p>
-        </w:tc>
-        <w:tc>
-          <w:tcPr>
-            <w:tcW w:w="600" w:type="pct"/>
-          </w:tcPr>
-          <w:p>
-            <w:pPr>
-              <w:spacing w:before="20" w:after="20"/>
-              <w:jc w:val="left"/>
-            </w:pPr>
-            <w:r>
-              <w:rPr>
-                <w:sz w:val="17"/>
-                <w:szCs w:val="17"/>
-                <w:lang w:val="en-IN"/>
-              </w:rPr>
-              <w:t xml:space="preserve"/>
-            </w:r>
-          </w:p>
-        </w:tc>
-        <w:tc>
-          <w:tcPr>
-            <w:tcW w:w="1250" w:type="pct"/>
-          </w:tcPr>
-          <w:p>
-            <w:pPr>
-              <w:spacing w:before="20" w:after="20"/>
-              <w:jc w:val="left"/>
-            </w:pPr>
-            <w:r>
-              <w:rPr>
-                <w:sz w:val="17"/>
-                <w:szCs w:val="17"/>
-                <w:lang w:val="en-IN"/>
-              </w:rPr>
-              <w:t xml:space="preserve">R-20 Acting for a team member: A record is raised for an engineer outside the manager’s team, or its authorship is lost</w:t>
-            </w:r>
-          </w:p>
-        </w:tc>
-        <w:tc>
-          <w:tcPr>
-            <w:tcW w:w="1550" w:type="pct"/>
-          </w:tcPr>
-          <w:p>
-            <w:pPr>
-              <w:spacing w:before="20" w:after="20"/>
-              <w:jc w:val="left"/>
-            </w:pPr>
-            <w:r>
-              <w:rPr>
-                <w:sz w:val="17"/>
-                <w:szCs w:val="17"/>
-                <w:lang w:val="en-IN"/>
-              </w:rPr>
-              <w:t xml:space="preserve">The list offered is the reporting sub-tree; created_by retains the author independently of the engineer named; OQ-24</w:t>
-            </w:r>
-          </w:p>
-        </w:tc>
-        <w:tc>
-          <w:tcPr>
-            <w:tcW w:w="500" w:type="pct"/>
-          </w:tcPr>
-          <w:p>
-            <w:pPr>
-              <w:spacing w:before="20" w:after="20"/>
-              <w:jc w:val="left"/>
-            </w:pPr>
-            <w:r>
-              <w:rPr>
-                <w:sz w:val="17"/>
-                <w:szCs w:val="17"/>
-                <w:lang w:val="en-IN"/>
-              </w:rPr>
-              <w:t xml:space="preserve"/>
-            </w:r>
-          </w:p>
-        </w:tc>
-        <w:tc>
-          <w:tcPr>
-            <w:tcW w:w="650" w:type="pct"/>
-          </w:tcPr>
-          <w:p>
-            <w:pPr>
-              <w:spacing w:before="20" w:after="20"/>
-              <w:jc w:val="left"/>
-            </w:pPr>
-            <w:r>
-              <w:rPr>
-                <w:sz w:val="17"/>
-                <w:szCs w:val="17"/>
-                <w:lang w:val="en-IN"/>
-              </w:rPr>
-              <w:t xml:space="preserve">Residual Low</w:t>
-            </w:r>
-          </w:p>
-        </w:tc>
-      </w:tr>
-      <w:tr>
-        <w:trPr>
-          <w:cantSplit/>
-        </w:trPr>
-        <w:tc>
-          <w:tcPr>
-            <w:tcW w:w="450" w:type="pct"/>
-          </w:tcPr>
-          <w:p>
-            <w:pPr>
-              <w:spacing w:before="20" w:after="20"/>
-              <w:jc w:val="left"/>
-            </w:pPr>
-            <w:r>
-              <w:rPr>
-                <w:sz w:val="17"/>
-                <w:szCs w:val="17"/>
-                <w:lang w:val="en-IN"/>
-              </w:rPr>
-              <w:t xml:space="preserve">5.25</w:t>
             </w:r>
           </w:p>
         </w:tc>
@@ -21169,49 +21050,49 @@
                 <w:szCs w:val="17"/>
                 <w:lang w:val="en-IN"/>
               </w:rPr>
-              <w:t xml:space="preserve">Requirements: URS-010, URS-011, URS-031, URS-040, URS-053, URS-060, URS-068, URS-069 … (+31 more)</w:t>
-            </w:r>
-          </w:p>
-          <w:p>
-            <w:pPr>
-              <w:spacing w:before="20" w:after="20"/>
-              <w:jc w:val="left"/>
-            </w:pPr>
-            <w:r>
-              <w:rPr>
-                <w:sz w:val="17"/>
-                <w:szCs w:val="17"/>
-                <w:lang w:val="en-IN"/>
-              </w:rPr>
-              <w:t xml:space="preserve">Functional: 121 (FRS-015, FRS-016, FRS-037, FRS-042, FRS-046 … (+116 more))</w:t>
-            </w:r>
-          </w:p>
-          <w:p>
-            <w:pPr>
-              <w:spacing w:before="20" w:after="20"/>
-              <w:jc w:val="left"/>
-            </w:pPr>
-            <w:r>
-              <w:rPr>
-                <w:sz w:val="17"/>
-                <w:szCs w:val="17"/>
-                <w:lang w:val="en-IN"/>
-              </w:rPr>
-              <w:t xml:space="preserve">Automated tests: 63 of 63 passed 27-Oct-2026</w:t>
-            </w:r>
-          </w:p>
-          <w:p>
-            <w:pPr>
-              <w:spacing w:before="20" w:after="20"/>
-              <w:jc w:val="left"/>
-            </w:pPr>
-            <w:r>
-              <w:rPr>
-                <w:sz w:val="17"/>
-                <w:szCs w:val="17"/>
-                <w:lang w:val="en-IN"/>
-              </w:rPr>
-              <w:t xml:space="preserve">Manual tests to execute: OQ-25, OQ-26, OQ-27, OQ-29, OQ-33, OQ-40 … (+71 more)</w:t>
+              <w:t xml:space="preserve">Requirements: URS-010, URS-011, URS-031, URS-040, URS-053, URS-060, URS-068, URS-069 … (+30 more)</w:t>
+            </w:r>
+          </w:p>
+          <w:p>
+            <w:pPr>
+              <w:spacing w:before="20" w:after="20"/>
+              <w:jc w:val="left"/>
+            </w:pPr>
+            <w:r>
+              <w:rPr>
+                <w:sz w:val="17"/>
+                <w:szCs w:val="17"/>
+                <w:lang w:val="en-IN"/>
+              </w:rPr>
+              <w:t xml:space="preserve">Functional: 118 (FRS-015, FRS-016, FRS-037, FRS-042, FRS-046 … (+113 more))</w:t>
+            </w:r>
+          </w:p>
+          <w:p>
+            <w:pPr>
+              <w:spacing w:before="20" w:after="20"/>
+              <w:jc w:val="left"/>
+            </w:pPr>
+            <w:r>
+              <w:rPr>
+                <w:sz w:val="17"/>
+                <w:szCs w:val="17"/>
+                <w:lang w:val="en-IN"/>
+              </w:rPr>
+              <w:t xml:space="preserve">Automated tests: 61 of 61 passed 27-Oct-2026</w:t>
+            </w:r>
+          </w:p>
+          <w:p>
+            <w:pPr>
+              <w:spacing w:before="20" w:after="20"/>
+              <w:jc w:val="left"/>
+            </w:pPr>
+            <w:r>
+              <w:rPr>
+                <w:sz w:val="17"/>
+                <w:szCs w:val="17"/>
+                <w:lang w:val="en-IN"/>
+              </w:rPr>
+              <w:t xml:space="preserve">Manual tests to execute: OQ-25, OQ-26, OQ-27, OQ-29, OQ-33, OQ-40 … (+70 more)</w:t>
             </w:r>
           </w:p>
         </w:tc>
@@ -21729,49 +21610,49 @@
                 <w:szCs w:val="17"/>
                 <w:lang w:val="en-IN"/>
               </w:rPr>
-              <w:t xml:space="preserve">Requirements: URS-002, URS-003, URS-004, URS-014, URS-025, URS-032, URS-034, URS-036 … (+58 more)</w:t>
-            </w:r>
-          </w:p>
-          <w:p>
-            <w:pPr>
-              <w:spacing w:before="20" w:after="20"/>
-              <w:jc w:val="left"/>
-            </w:pPr>
-            <w:r>
-              <w:rPr>
-                <w:sz w:val="17"/>
-                <w:szCs w:val="17"/>
-                <w:lang w:val="en-IN"/>
-              </w:rPr>
-              <w:t xml:space="preserve">Functional: 144 (FRS-003, FRS-004, FRS-005, FRS-006, FRS-007 … (+139 more))</w:t>
-            </w:r>
-          </w:p>
-          <w:p>
-            <w:pPr>
-              <w:spacing w:before="20" w:after="20"/>
-              <w:jc w:val="left"/>
-            </w:pPr>
-            <w:r>
-              <w:rPr>
-                <w:sz w:val="17"/>
-                <w:szCs w:val="17"/>
-                <w:lang w:val="en-IN"/>
-              </w:rPr>
-              <w:t xml:space="preserve">Automated tests: 75 of 75 passed 27-Oct-2026</w:t>
-            </w:r>
-          </w:p>
-          <w:p>
-            <w:pPr>
-              <w:spacing w:before="20" w:after="20"/>
-              <w:jc w:val="left"/>
-            </w:pPr>
-            <w:r>
-              <w:rPr>
-                <w:sz w:val="17"/>
-                <w:szCs w:val="17"/>
-                <w:lang w:val="en-IN"/>
-              </w:rPr>
-              <w:t xml:space="preserve">Manual tests to execute: IQ-02, OQ-02, OQ-03, OQ-04, OQ-05, OQ-11 … (+93 more)</w:t>
+              <w:t xml:space="preserve">Requirements: URS-002, URS-003, URS-004, URS-014, URS-025, URS-032, URS-034, URS-036 … (+57 more)</w:t>
+            </w:r>
+          </w:p>
+          <w:p>
+            <w:pPr>
+              <w:spacing w:before="20" w:after="20"/>
+              <w:jc w:val="left"/>
+            </w:pPr>
+            <w:r>
+              <w:rPr>
+                <w:sz w:val="17"/>
+                <w:szCs w:val="17"/>
+                <w:lang w:val="en-IN"/>
+              </w:rPr>
+              <w:t xml:space="preserve">Functional: 142 (FRS-003, FRS-004, FRS-005, FRS-006, FRS-007 … (+137 more))</w:t>
+            </w:r>
+          </w:p>
+          <w:p>
+            <w:pPr>
+              <w:spacing w:before="20" w:after="20"/>
+              <w:jc w:val="left"/>
+            </w:pPr>
+            <w:r>
+              <w:rPr>
+                <w:sz w:val="17"/>
+                <w:szCs w:val="17"/>
+                <w:lang w:val="en-IN"/>
+              </w:rPr>
+              <w:t xml:space="preserve">Automated tests: 74 of 74 passed 27-Oct-2026</w:t>
+            </w:r>
+          </w:p>
+          <w:p>
+            <w:pPr>
+              <w:spacing w:before="20" w:after="20"/>
+              <w:jc w:val="left"/>
+            </w:pPr>
+            <w:r>
+              <w:rPr>
+                <w:sz w:val="17"/>
+                <w:szCs w:val="17"/>
+                <w:lang w:val="en-IN"/>
+              </w:rPr>
+              <w:t xml:space="preserve">Manual tests to execute: IQ-02, OQ-02, OQ-03, OQ-04, OQ-05, OQ-11 … (+92 more)</w:t>
             </w:r>
           </w:p>
         </w:tc>
@@ -23696,21 +23577,21 @@
                 <w:szCs w:val="17"/>
                 <w:lang w:val="en-IN"/>
               </w:rPr>
-              <w:t xml:space="preserve">Functional: 146 (FRS-001, FRS-002, FRS-003, FRS-004, FRS-014 … (+141 more))</w:t>
-            </w:r>
-          </w:p>
-          <w:p>
-            <w:pPr>
-              <w:spacing w:before="20" w:after="20"/>
-              <w:jc w:val="left"/>
-            </w:pPr>
-            <w:r>
-              <w:rPr>
-                <w:sz w:val="17"/>
-                <w:szCs w:val="17"/>
-                <w:lang w:val="en-IN"/>
-              </w:rPr>
-              <w:t xml:space="preserve">Automated tests: 70 of 70 passed 27-Oct-2026</w:t>
+              <w:t xml:space="preserve">Functional: 145 (FRS-001, FRS-002, FRS-003, FRS-004, FRS-014 … (+140 more))</w:t>
+            </w:r>
+          </w:p>
+          <w:p>
+            <w:pPr>
+              <w:spacing w:before="20" w:after="20"/>
+              <w:jc w:val="left"/>
+            </w:pPr>
+            <w:r>
+              <w:rPr>
+                <w:sz w:val="17"/>
+                <w:szCs w:val="17"/>
+                <w:lang w:val="en-IN"/>
+              </w:rPr>
+              <w:t xml:space="preserve">Automated tests: 69 of 69 passed 27-Oct-2026</w:t>
             </w:r>
           </w:p>
           <w:p>
@@ -24774,7 +24655,7 @@
                 <w:szCs w:val="17"/>
                 <w:lang w:val="en-IN"/>
               </w:rPr>
-              <w:t xml:space="preserve">Functional: 67 (FRS-013, FRS-021, FRS-024, FRS-070, FRS-091 … (+62 more))</w:t>
+              <w:t xml:space="preserve">Functional: 68 (FRS-013, FRS-021, FRS-024, FRS-069, FRS-070 … (+63 more))</w:t>
             </w:r>
           </w:p>
           <w:p>
@@ -24802,7 +24683,7 @@
                 <w:szCs w:val="17"/>
                 <w:lang w:val="en-IN"/>
               </w:rPr>
-              <w:t xml:space="preserve">Manual tests to execute: IQ-01, OQ-08, OQ-09, OQ-53, OQ-90, OQ-91 … (+44 more)</w:t>
+              <w:t xml:space="preserve">Manual tests to execute: IQ-01, OQ-08, OQ-09, OQ-52, OQ-53, OQ-90 … (+45 more)</w:t>
             </w:r>
           </w:p>
         </w:tc>
@@ -25065,7 +24946,7 @@
         <w:rPr>
           <w:lang w:val="en-IN"/>
         </w:rPr>
-        <w:t xml:space="preserve">Non-auditable requirements (12) are listed in the package [4] and are not offered as evidence against a clause. Requirements in the package: 189 user, 285 functional; tests: 313. Open defects in the register: 87 (D-001, D-002, D-003, D-004, D-005, D-006, D-007, D-008, D-009, D-010 … (+77 more)).</w:t>
+        <w:t xml:space="preserve">Non-auditable requirements (13) are listed in the package [4] and are not offered as evidence against a clause. Requirements in the package: 188 user, 283 functional; tests: 311. Open defects in the register: 87 (D-001, D-002, D-003, D-004, D-005, D-006, D-007, D-008, D-009, D-010 … (+77 more)).</w:t>
       </w:r>
     </w:p>
     <w:p>

</xml_diff>